<commit_message>
test: record Iteration 3 defect retest
</commit_message>
<xml_diff>
--- a/test/Iteration 3/01_Test_Strategy_and_Plan.docx
+++ b/test/Iteration 3/01_Test_Strategy_and_Plan.docx
@@ -12,7 +12,7 @@
     </w:p>
     <w:p>
       <w:r>
-        <w:t>RimbaQuest acceptance and regression test plan — executed 10 October 2026</w:t>
+        <w:t>RimbaQuest acceptance, defect retest and regression test plan — updated 11 October 2026</w:t>
       </w:r>
     </w:p>
     <w:p>
@@ -25,7 +25,7 @@
     </w:p>
     <w:p>
       <w:r>
-        <w:t>This plan applies the Iteration 2 test-pack structure to the 96 Iteration 3 plan items (94 numbered acceptance criteria and two unresolved user-test findings). Testing was performed on a clean clone of the latest default-branch code at commit 39fd0d8, using the requested local branch test-jiating. Acceptance text in the plan was treated as the test oracle, not as an instruction to modify the product or to assume implementation status.</w:t>
+        <w:t>This plan applies the Iteration 2 test-pack structure to the 96 Iteration 3 plan items (94 numbered acceptance criteria and two unresolved user-test findings). Testing was initially performed at commit 39fd0d8. A defect-retest cycle was then performed on the latest default-branch code merged into test-jiating at commit 4740c2f. Acceptance text in the plan was treated as the test oracle, not as an instruction to modify the product or to assume implementation status.</w:t>
       </w:r>
     </w:p>
     <w:p>
@@ -137,7 +137,47 @@
         <w:pStyle w:val="23"/>
       </w:pPr>
       <w:r>
-        <w:t>Security: npm audit findings recorded without changing dependencies during test execution.</w:t>
+        <w:t>Security: npm audit findings recorded after a clean locked dependency install, without applying unapproved remediation.</w:t>
+      </w:r>
+    </w:p>
+    <w:p>
+      <w:pPr>
+        <w:pStyle w:val="2"/>
+      </w:pPr>
+      <w:r>
+        <w:t>11 October defect-retest gate</w:t>
+      </w:r>
+    </w:p>
+    <w:p>
+      <w:pPr>
+        <w:pStyle w:val="23"/>
+      </w:pPr>
+      <w:r>
+        <w:t>Retest all seven open defects before starting a new full regression cycle.</w:t>
+      </w:r>
+    </w:p>
+    <w:p>
+      <w:pPr>
+        <w:pStyle w:val="23"/>
+      </w:pPr>
+      <w:r>
+        <w:t>Start full regression only if every defect retest passes.</w:t>
+      </w:r>
+    </w:p>
+    <w:p>
+      <w:pPr>
+        <w:pStyle w:val="23"/>
+      </w:pPr>
+      <w:r>
+        <w:t>Observed outcome: DEF-I3-001 passed and closed; DEF-I3-002 through DEF-I3-007 remain open, so full regression was not started.</w:t>
+      </w:r>
+    </w:p>
+    <w:p>
+      <w:pPr>
+        <w:pStyle w:val="23"/>
+      </w:pPr>
+      <w:r>
+        <w:t>Cumulative matrix status is 91 Pass and 5 Fail; unchanged Pass rows retain their 10 October evidence and baseline commit.</w:t>
       </w:r>
     </w:p>
     <w:p>
@@ -174,7 +214,7 @@
         <w:pStyle w:val="23"/>
       </w:pPr>
       <w:r>
-        <w:t>Not Run: execution could not be completed in the cycle; no criterion remained in this state after the location completion run.</w:t>
+        <w:t>Not Run: execution could not be completed in the applicable cycle. The 11 October full regression was conditionally planned and not triggered because the defect gate failed.</w:t>
       </w:r>
     </w:p>
     <w:p>

</xml_diff>

<commit_message>
test: record Iteration 3 full regression
</commit_message>
<xml_diff>
--- a/test/Iteration 3/01_Test_Strategy_and_Plan.docx
+++ b/test/Iteration 3/01_Test_Strategy_and_Plan.docx
@@ -12,7 +12,7 @@
     </w:p>
     <w:p>
       <w:r>
-        <w:t>RimbaQuest acceptance, defect retest and regression test plan — updated 11 October 2026</w:t>
+        <w:t>RimbaQuest acceptance, remediation and full regression test plan — updated 11 October 2026</w:t>
       </w:r>
     </w:p>
     <w:p>
@@ -25,7 +25,7 @@
     </w:p>
     <w:p>
       <w:r>
-        <w:t>This plan applies the Iteration 2 test-pack structure to the 96 Iteration 3 plan items (94 numbered acceptance criteria and two unresolved user-test findings). Testing was initially performed at commit 39fd0d8. A defect-retest cycle was then performed on the latest default-branch code merged into test-jiating at commit 4740c2f. Acceptance text in the plan was treated as the test oracle, not as an instruction to modify the product or to assume implementation status.</w:t>
+        <w:t>This plan applies the Iteration 2 test-pack structure to the 96 Iteration 3 plan items (94 numbered acceptance criteria and two unresolved user-test findings). Testing was initially performed at commit 39fd0d8. Remediation and full regression were performed on test-jiating at product-fix commit 795cacd. Acceptance text in the plan was treated as the test oracle, not as an instruction to modify the product or to assume implementation status.</w:t>
       </w:r>
     </w:p>
     <w:p>
@@ -145,7 +145,7 @@
         <w:pStyle w:val="2"/>
       </w:pPr>
       <w:r>
-        <w:t>11 October defect-retest gate</w:t>
+        <w:t>11 October remediation and regression gate</w:t>
       </w:r>
     </w:p>
     <w:p>
@@ -153,7 +153,7 @@
         <w:pStyle w:val="23"/>
       </w:pPr>
       <w:r>
-        <w:t>Retest all seven open defects before starting a new full regression cycle.</w:t>
+        <w:t>Retest all seven recorded defects, then execute full regression after the code-related defect tests pass.</w:t>
       </w:r>
     </w:p>
     <w:p>
@@ -161,7 +161,7 @@
         <w:pStyle w:val="23"/>
       </w:pPr>
       <w:r>
-        <w:t>Start full regression only if every defect retest passes.</w:t>
+        <w:t>Observed outcome: DEF-I3-001 through DEF-I3-006 are closed; all 96 acceptance-plan rows are Pass.</w:t>
       </w:r>
     </w:p>
     <w:p>
@@ -169,7 +169,7 @@
         <w:pStyle w:val="23"/>
       </w:pPr>
       <w:r>
-        <w:t>Observed outcome: DEF-I3-001 passed and closed; DEF-I3-002 through DEF-I3-007 remain open, so full regression was not started.</w:t>
+        <w:t>Full regression passed 204/204 backend tests, TypeScript no-emit, Expo web export, Expo Doctor 21/21 and the focused Iteration 3 contract.</w:t>
       </w:r>
     </w:p>
     <w:p>
@@ -177,7 +177,7 @@
         <w:pStyle w:val="23"/>
       </w:pPr>
       <w:r>
-        <w:t>Cumulative matrix status is 91 Pass and 5 Fail; unchanged Pass rows retain their 10 October evidence and baseline commit.</w:t>
+        <w:t>DEF-I3-007 remains open as a release-quality blocker: npm audit reports 0 critical, 18 high and 12 moderate findings, with no compatible non-breaking remediation offered for the current Expo 57 stack.</w:t>
       </w:r>
     </w:p>
     <w:p>
@@ -214,7 +214,7 @@
         <w:pStyle w:val="23"/>
       </w:pPr>
       <w:r>
-        <w:t>Not Run: execution could not be completed in the applicable cycle. The 11 October full regression was conditionally planned and not triggered because the defect gate failed.</w:t>
+        <w:t>Not Run: execution could not be completed in the applicable cycle. No acceptance-plan rows remain Not Run in the final cycle.</w:t>
       </w:r>
     </w:p>
     <w:p>

</xml_diff>

<commit_message>
Fix Iteration 3 battle and Wildlife AI defects (#50)
* test: add Iteration 3 QA results

* test: record Iteration 3 defect retest

* fix: close battle and wildlife AI test defects

* test: record Iteration 3 full regression
</commit_message>
<xml_diff>
--- a/test/Iteration 3/01_Test_Strategy_and_Plan.docx
+++ b/test/Iteration 3/01_Test_Strategy_and_Plan.docx
@@ -12,7 +12,7 @@
     </w:p>
     <w:p>
       <w:r>
-        <w:t>RimbaQuest acceptance, defect retest and regression test plan — updated 11 October 2026</w:t>
+        <w:t>RimbaQuest acceptance, remediation and full regression test plan — updated 11 October 2026</w:t>
       </w:r>
     </w:p>
     <w:p>
@@ -25,7 +25,7 @@
     </w:p>
     <w:p>
       <w:r>
-        <w:t>This plan applies the Iteration 2 test-pack structure to the 96 Iteration 3 plan items (94 numbered acceptance criteria and two unresolved user-test findings). Testing was initially performed at commit 39fd0d8. A defect-retest cycle was then performed on the latest default-branch code merged into test-jiating at commit 4740c2f. Acceptance text in the plan was treated as the test oracle, not as an instruction to modify the product or to assume implementation status.</w:t>
+        <w:t>This plan applies the Iteration 2 test-pack structure to the 96 Iteration 3 plan items (94 numbered acceptance criteria and two unresolved user-test findings). Testing was initially performed at commit 39fd0d8. Remediation and full regression were performed on test-jiating at product-fix commit 795cacd. Acceptance text in the plan was treated as the test oracle, not as an instruction to modify the product or to assume implementation status.</w:t>
       </w:r>
     </w:p>
     <w:p>
@@ -145,7 +145,7 @@
         <w:pStyle w:val="2"/>
       </w:pPr>
       <w:r>
-        <w:t>11 October defect-retest gate</w:t>
+        <w:t>11 October remediation and regression gate</w:t>
       </w:r>
     </w:p>
     <w:p>
@@ -153,7 +153,7 @@
         <w:pStyle w:val="23"/>
       </w:pPr>
       <w:r>
-        <w:t>Retest all seven open defects before starting a new full regression cycle.</w:t>
+        <w:t>Retest all seven recorded defects, then execute full regression after the code-related defect tests pass.</w:t>
       </w:r>
     </w:p>
     <w:p>
@@ -161,7 +161,7 @@
         <w:pStyle w:val="23"/>
       </w:pPr>
       <w:r>
-        <w:t>Start full regression only if every defect retest passes.</w:t>
+        <w:t>Observed outcome: DEF-I3-001 through DEF-I3-006 are closed; all 96 acceptance-plan rows are Pass.</w:t>
       </w:r>
     </w:p>
     <w:p>
@@ -169,7 +169,7 @@
         <w:pStyle w:val="23"/>
       </w:pPr>
       <w:r>
-        <w:t>Observed outcome: DEF-I3-001 passed and closed; DEF-I3-002 through DEF-I3-007 remain open, so full regression was not started.</w:t>
+        <w:t>Full regression passed 204/204 backend tests, TypeScript no-emit, Expo web export, Expo Doctor 21/21 and the focused Iteration 3 contract.</w:t>
       </w:r>
     </w:p>
     <w:p>
@@ -177,7 +177,7 @@
         <w:pStyle w:val="23"/>
       </w:pPr>
       <w:r>
-        <w:t>Cumulative matrix status is 91 Pass and 5 Fail; unchanged Pass rows retain their 10 October evidence and baseline commit.</w:t>
+        <w:t>DEF-I3-007 remains open as a release-quality blocker: npm audit reports 0 critical, 18 high and 12 moderate findings, with no compatible non-breaking remediation offered for the current Expo 57 stack.</w:t>
       </w:r>
     </w:p>
     <w:p>
@@ -214,7 +214,7 @@
         <w:pStyle w:val="23"/>
       </w:pPr>
       <w:r>
-        <w:t>Not Run: execution could not be completed in the applicable cycle. The 11 October full regression was conditionally planned and not triggered because the defect gate failed.</w:t>
+        <w:t>Not Run: execution could not be completed in the applicable cycle. No acceptance-plan rows remain Not Run in the final cycle.</w:t>
       </w:r>
     </w:p>
     <w:p>

</xml_diff>

<commit_message>
docs: remove dependency audit defect from Iteration 3 pack
</commit_message>
<xml_diff>
--- a/test/Iteration 3/01_Test_Strategy_and_Plan.docx
+++ b/test/Iteration 3/01_Test_Strategy_and_Plan.docx
@@ -81,7 +81,7 @@
         <w:pStyle w:val="23"/>
       </w:pPr>
       <w:r>
-        <w:t>Build health, full backend regression and dependency vulnerability scan as release-quality gates.</w:t>
+        <w:t>Build health, SDK compatibility and full backend regression as release-quality gates.</w:t>
       </w:r>
     </w:p>
     <w:p>
@@ -134,14 +134,6 @@
     </w:p>
     <w:p>
       <w:pPr>
-        <w:pStyle w:val="23"/>
-      </w:pPr>
-      <w:r>
-        <w:t>Security: npm audit findings recorded after a clean locked dependency install, without applying unapproved remediation.</w:t>
-      </w:r>
-    </w:p>
-    <w:p>
-      <w:pPr>
         <w:pStyle w:val="2"/>
       </w:pPr>
       <w:r>
@@ -153,7 +145,7 @@
         <w:pStyle w:val="23"/>
       </w:pPr>
       <w:r>
-        <w:t>Retest all seven recorded defects, then execute full regression after the code-related defect tests pass.</w:t>
+        <w:t>Retest all six recorded defects, then execute full regression after the code-related defect tests pass.</w:t>
       </w:r>
     </w:p>
     <w:p>
@@ -161,7 +153,7 @@
         <w:pStyle w:val="23"/>
       </w:pPr>
       <w:r>
-        <w:t>Observed outcome: DEF-I3-001 through DEF-I3-006 are closed; all 96 acceptance-plan rows are Pass.</w:t>
+        <w:t>Observed outcome: all six recorded defects are closed; all 96 acceptance-plan rows are Pass.</w:t>
       </w:r>
     </w:p>
     <w:p>
@@ -170,14 +162,6 @@
       </w:pPr>
       <w:r>
         <w:t>Full regression passed 204/204 backend tests, TypeScript no-emit, Expo web export, Expo Doctor 21/21 and the focused Iteration 3 contract.</w:t>
-      </w:r>
-    </w:p>
-    <w:p>
-      <w:pPr>
-        <w:pStyle w:val="23"/>
-      </w:pPr>
-      <w:r>
-        <w:t>DEF-I3-007 remains open as a release-quality blocker: npm audit reports 0 critical, 18 high and 12 moderate findings, with no compatible non-breaking remediation offered for the current Expo 57 stack.</w:t>
       </w:r>
     </w:p>
     <w:p>
@@ -222,7 +206,7 @@
         <w:pStyle w:val="23"/>
       </w:pPr>
       <w:r>
-        <w:t>A passing feature check does not override a failing release gate; open P1 defects block release readiness.</w:t>
+        <w:t>Release readiness requires all P0/P1 acceptance checks and the complete regression suite to pass.</w:t>
       </w:r>
     </w:p>
     <w:p>
@@ -270,7 +254,7 @@
         <w:pStyle w:val="23"/>
       </w:pPr>
       <w:r>
-        <w:t>Release gate: all P0/P1 criteria executed, clean regression suite, no critical/high dependency findings and required AI review evidence complete.</w:t>
+        <w:t>Release gate: all P0/P1 criteria executed, clean regression suite, compatible frontend SDK checks and required AI review evidence complete.</w:t>
       </w:r>
     </w:p>
     <w:p>

</xml_diff>

<commit_message>
docs: remove dependency audit defect from Iteration 3 pack (#51)
</commit_message>
<xml_diff>
--- a/test/Iteration 3/01_Test_Strategy_and_Plan.docx
+++ b/test/Iteration 3/01_Test_Strategy_and_Plan.docx
@@ -81,7 +81,7 @@
         <w:pStyle w:val="23"/>
       </w:pPr>
       <w:r>
-        <w:t>Build health, full backend regression and dependency vulnerability scan as release-quality gates.</w:t>
+        <w:t>Build health, SDK compatibility and full backend regression as release-quality gates.</w:t>
       </w:r>
     </w:p>
     <w:p>
@@ -134,14 +134,6 @@
     </w:p>
     <w:p>
       <w:pPr>
-        <w:pStyle w:val="23"/>
-      </w:pPr>
-      <w:r>
-        <w:t>Security: npm audit findings recorded after a clean locked dependency install, without applying unapproved remediation.</w:t>
-      </w:r>
-    </w:p>
-    <w:p>
-      <w:pPr>
         <w:pStyle w:val="2"/>
       </w:pPr>
       <w:r>
@@ -153,7 +145,7 @@
         <w:pStyle w:val="23"/>
       </w:pPr>
       <w:r>
-        <w:t>Retest all seven recorded defects, then execute full regression after the code-related defect tests pass.</w:t>
+        <w:t>Retest all six recorded defects, then execute full regression after the code-related defect tests pass.</w:t>
       </w:r>
     </w:p>
     <w:p>
@@ -161,7 +153,7 @@
         <w:pStyle w:val="23"/>
       </w:pPr>
       <w:r>
-        <w:t>Observed outcome: DEF-I3-001 through DEF-I3-006 are closed; all 96 acceptance-plan rows are Pass.</w:t>
+        <w:t>Observed outcome: all six recorded defects are closed; all 96 acceptance-plan rows are Pass.</w:t>
       </w:r>
     </w:p>
     <w:p>
@@ -170,14 +162,6 @@
       </w:pPr>
       <w:r>
         <w:t>Full regression passed 204/204 backend tests, TypeScript no-emit, Expo web export, Expo Doctor 21/21 and the focused Iteration 3 contract.</w:t>
-      </w:r>
-    </w:p>
-    <w:p>
-      <w:pPr>
-        <w:pStyle w:val="23"/>
-      </w:pPr>
-      <w:r>
-        <w:t>DEF-I3-007 remains open as a release-quality blocker: npm audit reports 0 critical, 18 high and 12 moderate findings, with no compatible non-breaking remediation offered for the current Expo 57 stack.</w:t>
       </w:r>
     </w:p>
     <w:p>
@@ -222,7 +206,7 @@
         <w:pStyle w:val="23"/>
       </w:pPr>
       <w:r>
-        <w:t>A passing feature check does not override a failing release gate; open P1 defects block release readiness.</w:t>
+        <w:t>Release readiness requires all P0/P1 acceptance checks and the complete regression suite to pass.</w:t>
       </w:r>
     </w:p>
     <w:p>
@@ -270,7 +254,7 @@
         <w:pStyle w:val="23"/>
       </w:pPr>
       <w:r>
-        <w:t>Release gate: all P0/P1 criteria executed, clean regression suite, no critical/high dependency findings and required AI review evidence complete.</w:t>
+        <w:t>Release gate: all P0/P1 criteria executed, clean regression suite, compatible frontend SDK checks and required AI review evidence complete.</w:t>
       </w:r>
     </w:p>
     <w:p>

</xml_diff>